<commit_message>
Update DataPredict Libraries Licensing Agreement - Standard.docx
</commit_message>
<xml_diff>
--- a/docs/DataPredictLibrariesLicensingAgreements/DataPredict Libraries Licensing Agreement - Standard.docx
+++ b/docs/DataPredictLibrariesLicensingAgreements/DataPredict Libraries Licensing Agreement - Standard.docx
@@ -286,13 +286,7 @@
           <w:rPr>
             <w:rStyle w:val="Hyperlink"/>
           </w:rPr>
-          <w:t>https://github.com/AqwamCreates/DataPredict-</w:t>
-        </w:r>
-        <w:r>
-          <w:rPr>
-            <w:rStyle w:val="Hyperlink"/>
-          </w:rPr>
-          <w:t>Zero</w:t>
+          <w:t>https://github.com/AqwamCreates/DataPredict-Zero</w:t>
         </w:r>
       </w:hyperlink>
     </w:p>
@@ -303,11 +297,9 @@
           <w:numId w:val="2"/>
         </w:numPr>
       </w:pPr>
-      <w:proofErr w:type="spellStart"/>
       <w:r>
         <w:t>TensorL</w:t>
       </w:r>
-      <w:proofErr w:type="spellEnd"/>
       <w:r>
         <w:t>:</w:t>
       </w:r>
@@ -1128,28 +1120,58 @@
         <w:jc w:val="center"/>
       </w:pPr>
       <w:r>
-        <w:t>License Fee = Gross Revenue × (</w:t>
-      </w:r>
-      <w:r>
-        <w:t>0.</w:t>
-      </w:r>
-      <w:r>
-        <w:t>06</w:t>
+        <w:t xml:space="preserve">License Fee = </w:t>
+      </w:r>
+      <w:r>
+        <w:t xml:space="preserve">0.02 </w:t>
+      </w:r>
+      <w:r>
+        <w:t xml:space="preserve"> × </w:t>
+      </w:r>
+      <w:r>
+        <w:t>Gross Revenue × (</w:t>
+      </w:r>
+      <w:r>
+        <w:t>log</w:t>
+      </w:r>
+      <w:r>
+        <w:rPr>
+          <w:vertAlign w:val="subscript"/>
+        </w:rPr>
+        <w:t>10</w:t>
+      </w:r>
+      <w:r>
+        <w:t>(</w:t>
+      </w:r>
+      <w:r>
+        <w:t>200</w:t>
+      </w:r>
+      <w:r>
+        <w:t>)</w:t>
+      </w:r>
+      <w:r>
+        <w:t>/ log</w:t>
+      </w:r>
+      <w:r>
+        <w:rPr>
+          <w:vertAlign w:val="subscript"/>
+        </w:rPr>
+        <w:t>10</w:t>
+      </w:r>
+      <w:r>
+        <w:t>(</w:t>
+      </w:r>
+      <w:r>
+        <w:t xml:space="preserve">0.04 </w:t>
+      </w:r>
+      <w:r>
+        <w:t>×</w:t>
       </w:r>
       <w:r>
         <w:t xml:space="preserve"> </w:t>
       </w:r>
       <w:r>
-        <w:t>/ log</w:t>
-      </w:r>
-      <w:r>
-        <w:rPr>
-          <w:vertAlign w:val="subscript"/>
-        </w:rPr>
-        <w:t>0.5</w:t>
-      </w:r>
-      <w:r>
-        <w:t>(Gross Revenue))</w:t>
+        <w:t>Gross Revenue))</w:t>
       </w:r>
     </w:p>
     <w:p>
@@ -1427,13 +1449,8 @@
       <w:r>
         <w:t xml:space="preserve">fees from the Licensor </w:t>
       </w:r>
-      <w:proofErr w:type="gramStart"/>
-      <w:r>
-        <w:t>as a result of</w:t>
-      </w:r>
-      <w:proofErr w:type="gramEnd"/>
-      <w:r>
-        <w:t xml:space="preserve"> this</w:t>
+      <w:r>
+        <w:t>as a result of this</w:t>
       </w:r>
       <w:r>
         <w:t xml:space="preserve"> negative </w:t>
@@ -1574,15 +1591,7 @@
     </w:p>
     <w:p>
       <w:r>
-        <w:t xml:space="preserve">5.2. Any output, including but not limited to content, assets, or data generated </w:t>
-      </w:r>
-      <w:proofErr w:type="gramStart"/>
-      <w:r>
-        <w:t>by the use of</w:t>
-      </w:r>
-      <w:proofErr w:type="gramEnd"/>
-      <w:r>
-        <w:t xml:space="preserve"> the Software Libraries in the Licensed Experience shall be owned by the Licensee. This provision does not transfer any rights to the Software Libraries themselves or to any </w:t>
+        <w:t xml:space="preserve">5.2. Any output, including but not limited to content, assets, or data generated by the use of the Software Libraries in the Licensed Experience shall be owned by the Licensee. This provision does not transfer any rights to the Software Libraries themselves or to any </w:t>
       </w:r>
       <w:r>
         <w:t>D</w:t>
@@ -1948,13 +1957,8 @@
         <w:t>8</w:t>
       </w:r>
       <w:r>
-        <w:t xml:space="preserve">.2. Licensee may terminate this Agreement at any time without giving prior notice to Licensor. If termination occurs during a billing cycle and Licensee has paid for that cycle, Licensee may continue to use the Software Libraries until the end of the paid-up </w:t>
-      </w:r>
-      <w:proofErr w:type="gramStart"/>
-      <w:r>
-        <w:t>period</w:t>
-      </w:r>
-      <w:proofErr w:type="gramEnd"/>
+        <w:t>.2. Licensee may terminate this Agreement at any time without giving prior notice to Licensor. If termination occurs during a billing cycle and Licensee has paid for that cycle, Licensee may continue to use the Software Libraries until the end of the paid-up period</w:t>
+      </w:r>
       <w:r>
         <w:t xml:space="preserve"> and no refund will be given by the Licensor.</w:t>
       </w:r>

</xml_diff>